<commit_message>
README Paligemma 2 updated
</commit_message>
<xml_diff>
--- a/docs/GER_Report_final.docx
+++ b/docs/GER_Report_final.docx
@@ -65,6 +65,7 @@
         <w:pStyle w:val="Heading1"/>
         <w:spacing w:before="200" w:after="100"/>
       </w:pPr>
+      <w:proofErr w:type="gramStart"/>
       <w:r>
         <w:rPr>
           <w:sz w:val="24"/>
@@ -72,6 +73,7 @@
         </w:rPr>
         <w:t>1  Introduction</w:t>
       </w:r>
+      <w:proofErr w:type="gramEnd"/>
     </w:p>
     <w:p>
       <w:pPr>
@@ -79,7 +81,15 @@
         <w:jc w:val="both"/>
       </w:pPr>
       <w:r>
-        <w:t>Natural parks such as the Parco Nazionale della Sila receive thousands of visitors each year, yet park management lacks objective, real-time tools to assess how visitors emotionally perceive the environment. Understanding the collective emotional state of visitor groups can support crowd management, improve service quality, and contribute to conservation-aware tourism strategies.</w:t>
+        <w:t xml:space="preserve">Natural parks such as the Parco Nazionale della Sila receive thousands of visitors each year, yet park management </w:t>
+      </w:r>
+      <w:proofErr w:type="gramStart"/>
+      <w:r>
+        <w:t>lacks</w:t>
+      </w:r>
+      <w:proofErr w:type="gramEnd"/>
+      <w:r>
+        <w:t xml:space="preserve"> objective, real-time tools to assess how visitors emotionally perceive the environment. Understanding the collective emotional state of visitor groups can support crowd management, improve service quality, and contribute to conservation-aware tourism strategies.</w:t>
       </w:r>
     </w:p>
     <w:p>
@@ -204,6 +214,7 @@
         <w:pStyle w:val="Heading1"/>
         <w:spacing w:before="200" w:after="100"/>
       </w:pPr>
+      <w:proofErr w:type="gramStart"/>
       <w:r>
         <w:rPr>
           <w:sz w:val="24"/>
@@ -212,18 +223,28 @@
         <w:lastRenderedPageBreak/>
         <w:t>2  Analysis</w:t>
       </w:r>
+      <w:proofErr w:type="gramEnd"/>
     </w:p>
     <w:p>
       <w:pPr>
         <w:pStyle w:val="Heading2"/>
         <w:spacing w:before="160"/>
       </w:pPr>
+      <w:proofErr w:type="gramStart"/>
       <w:r>
         <w:rPr>
           <w:sz w:val="22"/>
           <w:szCs w:val="22"/>
         </w:rPr>
-        <w:t>2.1  Scenario and Constraints</w:t>
+        <w:t>2.1  Scenario</w:t>
+      </w:r>
+      <w:proofErr w:type="gramEnd"/>
+      <w:r>
+        <w:rPr>
+          <w:sz w:val="22"/>
+          <w:szCs w:val="22"/>
+        </w:rPr>
+        <w:t xml:space="preserve"> and Constraints</w:t>
       </w:r>
     </w:p>
     <w:p>
@@ -247,6 +268,9 @@
       <w:r>
         <w:t>Computation: edge devices are Raspberry Pi 4 single-board computers without a dedicated GPU, ruling out energy-intensive on-device VLM inference; all deep learning computation is offloaded to the cloud.</w:t>
       </w:r>
+      <w:r>
+        <w:tab/>
+      </w:r>
     </w:p>
     <w:p>
       <w:pPr>
@@ -292,12 +316,21 @@
         <w:pStyle w:val="Heading2"/>
         <w:spacing w:before="160"/>
       </w:pPr>
+      <w:proofErr w:type="gramStart"/>
       <w:r>
         <w:rPr>
           <w:sz w:val="22"/>
           <w:szCs w:val="22"/>
         </w:rPr>
-        <w:t>2.2  Functional Requirements</w:t>
+        <w:t>2.2  Functional</w:t>
+      </w:r>
+      <w:proofErr w:type="gramEnd"/>
+      <w:r>
+        <w:rPr>
+          <w:sz w:val="22"/>
+          <w:szCs w:val="22"/>
+        </w:rPr>
+        <w:t xml:space="preserve"> Requirements</w:t>
       </w:r>
     </w:p>
     <w:p>
@@ -396,12 +429,21 @@
         <w:pStyle w:val="Heading2"/>
         <w:spacing w:before="160"/>
       </w:pPr>
+      <w:proofErr w:type="gramStart"/>
       <w:r>
         <w:rPr>
           <w:sz w:val="22"/>
           <w:szCs w:val="22"/>
         </w:rPr>
-        <w:t>2.3  Non-Functional Requirements</w:t>
+        <w:t>2.3  Non</w:t>
+      </w:r>
+      <w:proofErr w:type="gramEnd"/>
+      <w:r>
+        <w:rPr>
+          <w:sz w:val="22"/>
+          <w:szCs w:val="22"/>
+        </w:rPr>
+        <w:t>-Functional Requirements</w:t>
       </w:r>
     </w:p>
     <w:p>
@@ -414,7 +456,15 @@
         <w:spacing w:before="40" w:after="40"/>
       </w:pPr>
       <w:r>
-        <w:t>NFR1 — Latency: emotion inference result available within 5 seconds of frame capture under normal network conditions.</w:t>
+        <w:t xml:space="preserve">NFR1 — Latency: emotion inference </w:t>
+      </w:r>
+      <w:proofErr w:type="gramStart"/>
+      <w:r>
+        <w:t>result</w:t>
+      </w:r>
+      <w:proofErr w:type="gramEnd"/>
+      <w:r>
+        <w:t xml:space="preserve"> available within 5 seconds of frame capture under normal network conditions.</w:t>
       </w:r>
     </w:p>
     <w:p>
@@ -487,12 +537,21 @@
         <w:pStyle w:val="Heading2"/>
         <w:spacing w:before="160"/>
       </w:pPr>
+      <w:proofErr w:type="gramStart"/>
       <w:r>
         <w:rPr>
           <w:sz w:val="22"/>
           <w:szCs w:val="22"/>
         </w:rPr>
-        <w:t>2.4  Analysis Models</w:t>
+        <w:t>2.4  Analysis</w:t>
+      </w:r>
+      <w:proofErr w:type="gramEnd"/>
+      <w:r>
+        <w:rPr>
+          <w:sz w:val="22"/>
+          <w:szCs w:val="22"/>
+        </w:rPr>
+        <w:t xml:space="preserve"> Models</w:t>
       </w:r>
     </w:p>
     <w:p>
@@ -526,12 +585,6 @@
         <w:gridCol w:w="4536"/>
       </w:tblGrid>
       <w:tr>
-        <w:tblPrEx>
-          <w:tblCellMar>
-            <w:top w:w="0" w:type="dxa"/>
-            <w:bottom w:w="0" w:type="dxa"/>
-          </w:tblCellMar>
-        </w:tblPrEx>
         <w:tc>
           <w:tcPr>
             <w:tcW w:w="4456" w:type="dxa"/>
@@ -650,6 +703,7 @@
         <w:pStyle w:val="Heading1"/>
         <w:spacing w:before="200" w:after="100"/>
       </w:pPr>
+      <w:proofErr w:type="gramStart"/>
       <w:r>
         <w:rPr>
           <w:sz w:val="24"/>
@@ -658,14 +712,20 @@
         <w:lastRenderedPageBreak/>
         <w:t>3  Design</w:t>
       </w:r>
+      <w:proofErr w:type="gramEnd"/>
     </w:p>
     <w:p>
       <w:pPr>
         <w:spacing w:before="80" w:after="80"/>
         <w:jc w:val="both"/>
       </w:pPr>
-      <w:r>
-        <w:t>On the basis of the identified requirements, the following design decisions have been taken.</w:t>
+      <w:proofErr w:type="gramStart"/>
+      <w:r>
+        <w:t>On the basis of</w:t>
+      </w:r>
+      <w:proofErr w:type="gramEnd"/>
+      <w:r>
+        <w:t xml:space="preserve"> the identified requirements, the following design decisions have been taken.</w:t>
       </w:r>
     </w:p>
     <w:p>
@@ -882,12 +942,6 @@
         <w:gridCol w:w="4899"/>
       </w:tblGrid>
       <w:tr>
-        <w:tblPrEx>
-          <w:tblCellMar>
-            <w:top w:w="0" w:type="dxa"/>
-            <w:bottom w:w="0" w:type="dxa"/>
-          </w:tblCellMar>
-        </w:tblPrEx>
         <w:tc>
           <w:tcPr>
             <w:tcW w:w="4173" w:type="dxa"/>
@@ -948,12 +1002,6 @@
         </w:tc>
       </w:tr>
       <w:tr>
-        <w:tblPrEx>
-          <w:tblCellMar>
-            <w:top w:w="0" w:type="dxa"/>
-            <w:bottom w:w="0" w:type="dxa"/>
-          </w:tblCellMar>
-        </w:tblPrEx>
         <w:tc>
           <w:tcPr>
             <w:tcW w:w="4173" w:type="dxa"/>
@@ -1008,12 +1056,6 @@
         </w:tc>
       </w:tr>
       <w:tr>
-        <w:tblPrEx>
-          <w:tblCellMar>
-            <w:top w:w="0" w:type="dxa"/>
-            <w:bottom w:w="0" w:type="dxa"/>
-          </w:tblCellMar>
-        </w:tblPrEx>
         <w:tc>
           <w:tcPr>
             <w:tcW w:w="4173" w:type="dxa"/>
@@ -1068,12 +1110,6 @@
         </w:tc>
       </w:tr>
       <w:tr>
-        <w:tblPrEx>
-          <w:tblCellMar>
-            <w:top w:w="0" w:type="dxa"/>
-            <w:bottom w:w="0" w:type="dxa"/>
-          </w:tblCellMar>
-        </w:tblPrEx>
         <w:tc>
           <w:tcPr>
             <w:tcW w:w="4173" w:type="dxa"/>
@@ -1128,12 +1164,6 @@
         </w:tc>
       </w:tr>
       <w:tr>
-        <w:tblPrEx>
-          <w:tblCellMar>
-            <w:top w:w="0" w:type="dxa"/>
-            <w:bottom w:w="0" w:type="dxa"/>
-          </w:tblCellMar>
-        </w:tblPrEx>
         <w:tc>
           <w:tcPr>
             <w:tcW w:w="4173" w:type="dxa"/>
@@ -1188,12 +1218,6 @@
         </w:tc>
       </w:tr>
       <w:tr>
-        <w:tblPrEx>
-          <w:tblCellMar>
-            <w:top w:w="0" w:type="dxa"/>
-            <w:bottom w:w="0" w:type="dxa"/>
-          </w:tblCellMar>
-        </w:tblPrEx>
         <w:tc>
           <w:tcPr>
             <w:tcW w:w="4173" w:type="dxa"/>
@@ -1248,12 +1272,6 @@
         </w:tc>
       </w:tr>
       <w:tr>
-        <w:tblPrEx>
-          <w:tblCellMar>
-            <w:top w:w="0" w:type="dxa"/>
-            <w:bottom w:w="0" w:type="dxa"/>
-          </w:tblCellMar>
-        </w:tblPrEx>
         <w:tc>
           <w:tcPr>
             <w:tcW w:w="4173" w:type="dxa"/>
@@ -1308,12 +1326,6 @@
         </w:tc>
       </w:tr>
       <w:tr>
-        <w:tblPrEx>
-          <w:tblCellMar>
-            <w:top w:w="0" w:type="dxa"/>
-            <w:bottom w:w="0" w:type="dxa"/>
-          </w:tblCellMar>
-        </w:tblPrEx>
         <w:tc>
           <w:tcPr>
             <w:tcW w:w="4173" w:type="dxa"/>
@@ -1368,12 +1380,6 @@
         </w:tc>
       </w:tr>
       <w:tr>
-        <w:tblPrEx>
-          <w:tblCellMar>
-            <w:top w:w="0" w:type="dxa"/>
-            <w:bottom w:w="0" w:type="dxa"/>
-          </w:tblCellMar>
-        </w:tblPrEx>
         <w:tc>
           <w:tcPr>
             <w:tcW w:w="4173" w:type="dxa"/>
@@ -1428,12 +1434,6 @@
         </w:tc>
       </w:tr>
       <w:tr>
-        <w:tblPrEx>
-          <w:tblCellMar>
-            <w:top w:w="0" w:type="dxa"/>
-            <w:bottom w:w="0" w:type="dxa"/>
-          </w:tblCellMar>
-        </w:tblPrEx>
         <w:tc>
           <w:tcPr>
             <w:tcW w:w="4173" w:type="dxa"/>
@@ -1488,12 +1488,6 @@
         </w:tc>
       </w:tr>
       <w:tr>
-        <w:tblPrEx>
-          <w:tblCellMar>
-            <w:top w:w="0" w:type="dxa"/>
-            <w:bottom w:w="0" w:type="dxa"/>
-          </w:tblCellMar>
-        </w:tblPrEx>
         <w:tc>
           <w:tcPr>
             <w:tcW w:w="4173" w:type="dxa"/>
@@ -1555,6 +1549,7 @@
         <w:pStyle w:val="Heading1"/>
         <w:spacing w:before="200" w:after="100"/>
       </w:pPr>
+      <w:proofErr w:type="gramStart"/>
       <w:r>
         <w:rPr>
           <w:sz w:val="24"/>
@@ -1562,6 +1557,7 @@
         </w:rPr>
         <w:t>4  Implementation</w:t>
       </w:r>
+      <w:proofErr w:type="gramEnd"/>
     </w:p>
     <w:p>
       <w:pPr>
@@ -1610,12 +1606,6 @@
         <w:gridCol w:w="5625"/>
       </w:tblGrid>
       <w:tr>
-        <w:tblPrEx>
-          <w:tblCellMar>
-            <w:top w:w="0" w:type="dxa"/>
-            <w:bottom w:w="0" w:type="dxa"/>
-          </w:tblCellMar>
-        </w:tblPrEx>
         <w:tc>
           <w:tcPr>
             <w:tcW w:w="3447" w:type="dxa"/>
@@ -1676,12 +1666,6 @@
         </w:tc>
       </w:tr>
       <w:tr>
-        <w:tblPrEx>
-          <w:tblCellMar>
-            <w:top w:w="0" w:type="dxa"/>
-            <w:bottom w:w="0" w:type="dxa"/>
-          </w:tblCellMar>
-        </w:tblPrEx>
         <w:tc>
           <w:tcPr>
             <w:tcW w:w="3447" w:type="dxa"/>
@@ -1736,12 +1720,6 @@
         </w:tc>
       </w:tr>
       <w:tr>
-        <w:tblPrEx>
-          <w:tblCellMar>
-            <w:top w:w="0" w:type="dxa"/>
-            <w:bottom w:w="0" w:type="dxa"/>
-          </w:tblCellMar>
-        </w:tblPrEx>
         <w:tc>
           <w:tcPr>
             <w:tcW w:w="3447" w:type="dxa"/>
@@ -1796,12 +1774,6 @@
         </w:tc>
       </w:tr>
       <w:tr>
-        <w:tblPrEx>
-          <w:tblCellMar>
-            <w:top w:w="0" w:type="dxa"/>
-            <w:bottom w:w="0" w:type="dxa"/>
-          </w:tblCellMar>
-        </w:tblPrEx>
         <w:tc>
           <w:tcPr>
             <w:tcW w:w="3447" w:type="dxa"/>
@@ -1897,12 +1869,6 @@
         </w:tc>
       </w:tr>
       <w:tr>
-        <w:tblPrEx>
-          <w:tblCellMar>
-            <w:top w:w="0" w:type="dxa"/>
-            <w:bottom w:w="0" w:type="dxa"/>
-          </w:tblCellMar>
-        </w:tblPrEx>
         <w:tc>
           <w:tcPr>
             <w:tcW w:w="3447" w:type="dxa"/>
@@ -1957,12 +1923,6 @@
         </w:tc>
       </w:tr>
       <w:tr>
-        <w:tblPrEx>
-          <w:tblCellMar>
-            <w:top w:w="0" w:type="dxa"/>
-            <w:bottom w:w="0" w:type="dxa"/>
-          </w:tblCellMar>
-        </w:tblPrEx>
         <w:tc>
           <w:tcPr>
             <w:tcW w:w="3447" w:type="dxa"/>
@@ -2017,12 +1977,6 @@
         </w:tc>
       </w:tr>
       <w:tr>
-        <w:tblPrEx>
-          <w:tblCellMar>
-            <w:top w:w="0" w:type="dxa"/>
-            <w:bottom w:w="0" w:type="dxa"/>
-          </w:tblCellMar>
-        </w:tblPrEx>
         <w:tc>
           <w:tcPr>
             <w:tcW w:w="3447" w:type="dxa"/>
@@ -2077,12 +2031,6 @@
         </w:tc>
       </w:tr>
       <w:tr>
-        <w:tblPrEx>
-          <w:tblCellMar>
-            <w:top w:w="0" w:type="dxa"/>
-            <w:bottom w:w="0" w:type="dxa"/>
-          </w:tblCellMar>
-        </w:tblPrEx>
         <w:tc>
           <w:tcPr>
             <w:tcW w:w="3447" w:type="dxa"/>
@@ -2137,12 +2085,6 @@
         </w:tc>
       </w:tr>
       <w:tr>
-        <w:tblPrEx>
-          <w:tblCellMar>
-            <w:top w:w="0" w:type="dxa"/>
-            <w:bottom w:w="0" w:type="dxa"/>
-          </w:tblCellMar>
-        </w:tblPrEx>
         <w:tc>
           <w:tcPr>
             <w:tcW w:w="3447" w:type="dxa"/>
@@ -2197,12 +2139,6 @@
         </w:tc>
       </w:tr>
       <w:tr>
-        <w:tblPrEx>
-          <w:tblCellMar>
-            <w:top w:w="0" w:type="dxa"/>
-            <w:bottom w:w="0" w:type="dxa"/>
-          </w:tblCellMar>
-        </w:tblPrEx>
         <w:tc>
           <w:tcPr>
             <w:tcW w:w="3447" w:type="dxa"/>
@@ -2257,12 +2193,6 @@
         </w:tc>
       </w:tr>
       <w:tr>
-        <w:tblPrEx>
-          <w:tblCellMar>
-            <w:top w:w="0" w:type="dxa"/>
-            <w:bottom w:w="0" w:type="dxa"/>
-          </w:tblCellMar>
-        </w:tblPrEx>
         <w:tc>
           <w:tcPr>
             <w:tcW w:w="3447" w:type="dxa"/>
@@ -2317,12 +2247,6 @@
         </w:tc>
       </w:tr>
       <w:tr>
-        <w:tblPrEx>
-          <w:tblCellMar>
-            <w:top w:w="0" w:type="dxa"/>
-            <w:bottom w:w="0" w:type="dxa"/>
-          </w:tblCellMar>
-        </w:tblPrEx>
         <w:tc>
           <w:tcPr>
             <w:tcW w:w="3447" w:type="dxa"/>
@@ -2395,12 +2319,6 @@
         </w:tc>
       </w:tr>
       <w:tr>
-        <w:tblPrEx>
-          <w:tblCellMar>
-            <w:top w:w="0" w:type="dxa"/>
-            <w:bottom w:w="0" w:type="dxa"/>
-          </w:tblCellMar>
-        </w:tblPrEx>
         <w:tc>
           <w:tcPr>
             <w:tcW w:w="3447" w:type="dxa"/>
@@ -2536,12 +2454,6 @@
         <w:gridCol w:w="9072"/>
       </w:tblGrid>
       <w:tr>
-        <w:tblPrEx>
-          <w:tblCellMar>
-            <w:top w:w="0" w:type="dxa"/>
-            <w:bottom w:w="0" w:type="dxa"/>
-          </w:tblCellMar>
-        </w:tblPrEx>
         <w:tc>
           <w:tcPr>
             <w:tcW w:w="9072" w:type="dxa"/>
@@ -2565,7 +2477,8 @@
                 <w:rFonts w:ascii="Courier New" w:hAnsi="Courier New"/>
                 <w:sz w:val="16"/>
               </w:rPr>
-              <w:t xml:space="preserve">+---------------------------------------------------------------------------+</w:t>
+              <w:lastRenderedPageBreak/>
+              <w:t>+---------------------------------------------------------------------------+</w:t>
             </w:r>
           </w:p>
           <w:p>
@@ -2584,75 +2497,159 @@
             </w:r>
           </w:p>
           <w:p>
-            <w:r>
-              <w:rPr>
-                <w:rFonts w:ascii="Courier New" w:hAnsi="Courier New"/>
-                <w:sz w:val="16"/>
-              </w:rPr>
-              <w:t xml:space="preserve">|  EDGE                                                                     |</w:t>
-            </w:r>
-          </w:p>
-          <w:p>
-            <w:r>
-              <w:rPr>
-                <w:rFonts w:ascii="Courier New" w:hAnsi="Courier New"/>
-                <w:sz w:val="16"/>
-              </w:rPr>
-              <w:t xml:space="preserve">|                                                                           |</w:t>
-            </w:r>
-          </w:p>
-          <w:p>
-            <w:r>
-              <w:rPr>
-                <w:rFonts w:ascii="Courier New" w:hAnsi="Courier New"/>
-                <w:sz w:val="16"/>
-              </w:rPr>
-              <w:t xml:space="preserve">|  +--------------------+                                                   |</w:t>
-            </w:r>
-          </w:p>
-          <w:p>
-            <w:r>
-              <w:rPr>
-                <w:rFonts w:ascii="Courier New" w:hAnsi="Courier New"/>
-                <w:sz w:val="16"/>
-              </w:rPr>
-              <w:t xml:space="preserve">|  |  Raspberry Pi 4    |  JPEG frame (REST/HTTPS)                         |</w:t>
-            </w:r>
-          </w:p>
-          <w:p>
-            <w:r>
-              <w:rPr>
-                <w:rFonts w:ascii="Courier New" w:hAnsi="Courier New"/>
-                <w:sz w:val="16"/>
-              </w:rPr>
-              <w:t xml:space="preserve">|  |  USB camera        | ------------------------------------------------&gt; |</w:t>
-            </w:r>
-          </w:p>
-          <w:p>
-            <w:r>
-              <w:rPr>
-                <w:rFonts w:ascii="Courier New" w:hAnsi="Courier New"/>
-                <w:sz w:val="16"/>
-              </w:rPr>
-              <w:t xml:space="preserve">|  |  (capture+compress)|                                                   |</w:t>
-            </w:r>
-          </w:p>
-          <w:p>
-            <w:r>
-              <w:rPr>
-                <w:rFonts w:ascii="Courier New" w:hAnsi="Courier New"/>
-                <w:sz w:val="16"/>
-              </w:rPr>
-              <w:t xml:space="preserve">|  +--------------------+                                                   |</w:t>
-            </w:r>
-          </w:p>
-          <w:p>
-            <w:r>
-              <w:rPr>
-                <w:rFonts w:ascii="Courier New" w:hAnsi="Courier New"/>
-                <w:sz w:val="16"/>
-              </w:rPr>
-              <w:t xml:space="preserve">+---------------------------------------------------------------------------+</w:t>
+            <w:proofErr w:type="gramStart"/>
+            <w:r>
+              <w:rPr>
+                <w:rFonts w:ascii="Courier New" w:hAnsi="Courier New"/>
+                <w:sz w:val="16"/>
+              </w:rPr>
+              <w:t>|  EDGE</w:t>
+            </w:r>
+            <w:proofErr w:type="gramEnd"/>
+            <w:r>
+              <w:rPr>
+                <w:rFonts w:ascii="Courier New" w:hAnsi="Courier New"/>
+                <w:sz w:val="16"/>
+              </w:rPr>
+              <w:t xml:space="preserve">                                                                     |</w:t>
+            </w:r>
+          </w:p>
+          <w:p>
+            <w:r>
+              <w:rPr>
+                <w:rFonts w:ascii="Courier New" w:hAnsi="Courier New"/>
+                <w:sz w:val="16"/>
+              </w:rPr>
+              <w:t>|                                                                           |</w:t>
+            </w:r>
+          </w:p>
+          <w:p>
+            <w:r>
+              <w:rPr>
+                <w:rFonts w:ascii="Courier New" w:hAnsi="Courier New"/>
+                <w:sz w:val="16"/>
+              </w:rPr>
+              <w:t>|  +--------------------+                                                   |</w:t>
+            </w:r>
+          </w:p>
+          <w:p>
+            <w:proofErr w:type="gramStart"/>
+            <w:r>
+              <w:rPr>
+                <w:rFonts w:ascii="Courier New" w:hAnsi="Courier New"/>
+                <w:sz w:val="16"/>
+              </w:rPr>
+              <w:t>|  |</w:t>
+            </w:r>
+            <w:proofErr w:type="gramEnd"/>
+            <w:r>
+              <w:rPr>
+                <w:rFonts w:ascii="Courier New" w:hAnsi="Courier New"/>
+                <w:sz w:val="16"/>
+              </w:rPr>
+              <w:t xml:space="preserve">  Raspberry Pi 4    </w:t>
+            </w:r>
+            <w:proofErr w:type="gramStart"/>
+            <w:r>
+              <w:rPr>
+                <w:rFonts w:ascii="Courier New" w:hAnsi="Courier New"/>
+                <w:sz w:val="16"/>
+              </w:rPr>
+              <w:t>|  JPEG</w:t>
+            </w:r>
+            <w:proofErr w:type="gramEnd"/>
+            <w:r>
+              <w:rPr>
+                <w:rFonts w:ascii="Courier New" w:hAnsi="Courier New"/>
+                <w:sz w:val="16"/>
+              </w:rPr>
+              <w:t xml:space="preserve"> frame (REST/</w:t>
+            </w:r>
+            <w:proofErr w:type="gramStart"/>
+            <w:r>
+              <w:rPr>
+                <w:rFonts w:ascii="Courier New" w:hAnsi="Courier New"/>
+                <w:sz w:val="16"/>
+              </w:rPr>
+              <w:t xml:space="preserve">HTTPS)   </w:t>
+            </w:r>
+            <w:proofErr w:type="gramEnd"/>
+            <w:r>
+              <w:rPr>
+                <w:rFonts w:ascii="Courier New" w:hAnsi="Courier New"/>
+                <w:sz w:val="16"/>
+              </w:rPr>
+              <w:t xml:space="preserve">                      |</w:t>
+            </w:r>
+          </w:p>
+          <w:p>
+            <w:proofErr w:type="gramStart"/>
+            <w:r>
+              <w:rPr>
+                <w:rFonts w:ascii="Courier New" w:hAnsi="Courier New"/>
+                <w:sz w:val="16"/>
+              </w:rPr>
+              <w:t>|  |</w:t>
+            </w:r>
+            <w:proofErr w:type="gramEnd"/>
+            <w:r>
+              <w:rPr>
+                <w:rFonts w:ascii="Courier New" w:hAnsi="Courier New"/>
+                <w:sz w:val="16"/>
+              </w:rPr>
+              <w:t xml:space="preserve">  USB camera        | ------------------------------------------------&gt; |</w:t>
+            </w:r>
+          </w:p>
+          <w:p>
+            <w:proofErr w:type="gramStart"/>
+            <w:r>
+              <w:rPr>
+                <w:rFonts w:ascii="Courier New" w:hAnsi="Courier New"/>
+                <w:sz w:val="16"/>
+              </w:rPr>
+              <w:t>|  |</w:t>
+            </w:r>
+            <w:proofErr w:type="gramEnd"/>
+            <w:r>
+              <w:rPr>
+                <w:rFonts w:ascii="Courier New" w:hAnsi="Courier New"/>
+                <w:sz w:val="16"/>
+              </w:rPr>
+              <w:t xml:space="preserve">  (capture+</w:t>
+            </w:r>
+            <w:proofErr w:type="gramStart"/>
+            <w:r>
+              <w:rPr>
+                <w:rFonts w:ascii="Courier New" w:hAnsi="Courier New"/>
+                <w:sz w:val="16"/>
+              </w:rPr>
+              <w:t>compress)|</w:t>
+            </w:r>
+            <w:proofErr w:type="gramEnd"/>
+            <w:r>
+              <w:rPr>
+                <w:rFonts w:ascii="Courier New" w:hAnsi="Courier New"/>
+                <w:sz w:val="16"/>
+              </w:rPr>
+              <w:t xml:space="preserve">                                                   |</w:t>
+            </w:r>
+          </w:p>
+          <w:p>
+            <w:r>
+              <w:rPr>
+                <w:rFonts w:ascii="Courier New" w:hAnsi="Courier New"/>
+                <w:sz w:val="16"/>
+              </w:rPr>
+              <w:t>|  +--------------------+                                                   |</w:t>
+            </w:r>
+          </w:p>
+          <w:p>
+            <w:r>
+              <w:rPr>
+                <w:rFonts w:ascii="Courier New" w:hAnsi="Courier New"/>
+                <w:sz w:val="16"/>
+              </w:rPr>
+              <w:t>+---------------------------------------------------------------------------+</w:t>
             </w:r>
           </w:p>
           <w:p>
@@ -2679,295 +2676,663 @@
                 <w:rFonts w:ascii="Courier New" w:hAnsi="Courier New"/>
                 <w:sz w:val="16"/>
               </w:rPr>
-              <w:t xml:space="preserve">+---------------------------------------------------------------------------+</w:t>
-            </w:r>
-          </w:p>
-          <w:p>
-            <w:r>
-              <w:rPr>
-                <w:rFonts w:ascii="Courier New" w:hAnsi="Courier New"/>
-                <w:sz w:val="16"/>
-              </w:rPr>
-              <w:t xml:space="preserve">|  CLOUD (AWS eu-west-1)                                                    |</w:t>
-            </w:r>
-          </w:p>
-          <w:p>
-            <w:r>
-              <w:rPr>
-                <w:rFonts w:ascii="Courier New" w:hAnsi="Courier New"/>
-                <w:sz w:val="16"/>
-              </w:rPr>
-              <w:t xml:space="preserve">|                                                                           |</w:t>
-            </w:r>
-          </w:p>
-          <w:p>
-            <w:r>
-              <w:rPr>
-                <w:rFonts w:ascii="Courier New" w:hAnsi="Courier New"/>
-                <w:sz w:val="16"/>
-              </w:rPr>
-              <w:t xml:space="preserve">|  +----------------+                                                       |</w:t>
-            </w:r>
-          </w:p>
-          <w:p>
-            <w:r>
-              <w:rPr>
-                <w:rFonts w:ascii="Courier New" w:hAnsi="Courier New"/>
-                <w:sz w:val="16"/>
-              </w:rPr>
-              <w:t xml:space="preserve">|  |  API Gateway   |                                                       |</w:t>
-            </w:r>
-          </w:p>
-          <w:p>
-            <w:r>
-              <w:rPr>
-                <w:rFonts w:ascii="Courier New" w:hAnsi="Courier New"/>
-                <w:sz w:val="16"/>
-              </w:rPr>
-              <w:t xml:space="preserve">|  |  + Cognito auth|                                                       |</w:t>
-            </w:r>
-          </w:p>
-          <w:p>
-            <w:r>
-              <w:rPr>
-                <w:rFonts w:ascii="Courier New" w:hAnsi="Courier New"/>
-                <w:sz w:val="16"/>
-              </w:rPr>
-              <w:t xml:space="preserve">|  +-------+--------+                                                       |</w:t>
-            </w:r>
-          </w:p>
-          <w:p>
-            <w:r>
-              <w:rPr>
-                <w:rFonts w:ascii="Courier New" w:hAnsi="Courier New"/>
-                <w:sz w:val="16"/>
-              </w:rPr>
-              <w:t xml:space="preserve">|          |                                                                 |</w:t>
-            </w:r>
-          </w:p>
-          <w:p>
-            <w:r>
-              <w:rPr>
-                <w:rFonts w:ascii="Courier New" w:hAnsi="Courier New"/>
-                <w:sz w:val="16"/>
-              </w:rPr>
-              <w:t xml:space="preserve">|          v                                                                 |</w:t>
-            </w:r>
-          </w:p>
-          <w:p>
-            <w:r>
-              <w:rPr>
-                <w:rFonts w:ascii="Courier New" w:hAnsi="Courier New"/>
-                <w:sz w:val="16"/>
-              </w:rPr>
-              <w:t xml:space="preserve">|  +--------------------------------------------------------------------+   |</w:t>
-            </w:r>
-          </w:p>
-          <w:p>
-            <w:r>
-              <w:rPr>
-                <w:rFonts w:ascii="Courier New" w:hAnsi="Courier New"/>
-                <w:sz w:val="16"/>
-              </w:rPr>
-              <w:t xml:space="preserve">|  |  EC2 g4dn.xlarge (same instance)                                   |   |</w:t>
-            </w:r>
-          </w:p>
-          <w:p>
-            <w:r>
-              <w:rPr>
-                <w:rFonts w:ascii="Courier New" w:hAnsi="Courier New"/>
-                <w:sz w:val="16"/>
-              </w:rPr>
-              <w:t xml:space="preserve">|  |                                                                    |   |</w:t>
-            </w:r>
-          </w:p>
-          <w:p>
-            <w:r>
-              <w:rPr>
-                <w:rFonts w:ascii="Courier New" w:hAnsi="Courier New"/>
-                <w:sz w:val="16"/>
-              </w:rPr>
-              <w:t xml:space="preserve">|  |  +-------------------+     +------------------------------+        |   |</w:t>
-            </w:r>
-          </w:p>
-          <w:p>
-            <w:r>
-              <w:rPr>
-                <w:rFonts w:ascii="Courier New" w:hAnsi="Courier New"/>
-                <w:sz w:val="16"/>
-              </w:rPr>
-              <w:t xml:space="preserve">|  |  |  FastAPI backend  |----&gt;|  VLM inference server        |        |   |</w:t>
-            </w:r>
-          </w:p>
-          <w:p>
-            <w:r>
-              <w:rPr>
-                <w:rFonts w:ascii="Courier New" w:hAnsi="Courier New"/>
-                <w:sz w:val="16"/>
-              </w:rPr>
-              <w:t xml:space="preserve">|  |  |  (port 8000)      |     |  (separate process, port     |        |   |</w:t>
-            </w:r>
-          </w:p>
-          <w:p>
-            <w:r>
-              <w:rPr>
-                <w:rFonts w:ascii="Courier New" w:hAnsi="Courier New"/>
-                <w:sz w:val="16"/>
-              </w:rPr>
-              <w:t xml:space="preserve">|  |  +--------+----------+     |   8001)                      |        |   |</w:t>
-            </w:r>
-          </w:p>
-          <w:p>
-            <w:r>
-              <w:rPr>
-                <w:rFonts w:ascii="Courier New" w:hAnsi="Courier New"/>
-                <w:sz w:val="16"/>
-              </w:rPr>
-              <w:t xml:space="preserve">|  |           |                +------------------------------+        |   |</w:t>
-            </w:r>
-          </w:p>
-          <w:p>
-            <w:r>
-              <w:rPr>
-                <w:rFonts w:ascii="Courier New" w:hAnsi="Courier New"/>
-                <w:sz w:val="16"/>
-              </w:rPr>
-              <w:t xml:space="preserve">|  |           v                                                        |   |</w:t>
-            </w:r>
-          </w:p>
-          <w:p>
-            <w:r>
-              <w:rPr>
-                <w:rFonts w:ascii="Courier New" w:hAnsi="Courier New"/>
-                <w:sz w:val="16"/>
-              </w:rPr>
-              <w:t xml:space="preserve">|  |  +-------------------+                                             |   |</w:t>
-            </w:r>
-          </w:p>
-          <w:p>
-            <w:r>
-              <w:rPr>
-                <w:rFonts w:ascii="Courier New" w:hAnsi="Courier New"/>
-                <w:sz w:val="16"/>
-              </w:rPr>
-              <w:t xml:space="preserve">|  |  |  MySQL            |                                             |   |</w:t>
-            </w:r>
-          </w:p>
-          <w:p>
-            <w:r>
-              <w:rPr>
-                <w:rFonts w:ascii="Courier New" w:hAnsi="Courier New"/>
-                <w:sz w:val="16"/>
-              </w:rPr>
-              <w:t xml:space="preserve">|  |  |  (localhost:3306) |                                             |   |</w:t>
-            </w:r>
-          </w:p>
-          <w:p>
-            <w:r>
-              <w:rPr>
-                <w:rFonts w:ascii="Courier New" w:hAnsi="Courier New"/>
-                <w:sz w:val="16"/>
-              </w:rPr>
-              <w:t xml:space="preserve">|  |  +-------------------+                                             |   |</w:t>
-            </w:r>
-          </w:p>
-          <w:p>
-            <w:r>
-              <w:rPr>
-                <w:rFonts w:ascii="Courier New" w:hAnsi="Courier New"/>
-                <w:sz w:val="16"/>
-              </w:rPr>
-              <w:t xml:space="preserve">|  +--------------------------------------------------------------------+   |</w:t>
-            </w:r>
-          </w:p>
-          <w:p>
-            <w:r>
-              <w:rPr>
-                <w:rFonts w:ascii="Courier New" w:hAnsi="Courier New"/>
-                <w:sz w:val="16"/>
-              </w:rPr>
-              <w:t xml:space="preserve">|                                                                           |</w:t>
-            </w:r>
-          </w:p>
-          <w:p>
-            <w:r>
-              <w:rPr>
-                <w:rFonts w:ascii="Courier New" w:hAnsi="Courier New"/>
-                <w:sz w:val="16"/>
-              </w:rPr>
-              <w:t xml:space="preserve">|  +--------------+      +--------------------------------------+           |</w:t>
-            </w:r>
-          </w:p>
-          <w:p>
-            <w:r>
-              <w:rPr>
-                <w:rFonts w:ascii="Courier New" w:hAnsi="Courier New"/>
-                <w:sz w:val="16"/>
-              </w:rPr>
-              <w:t xml:space="preserve">|  |  S3          |      |  Flutter Mobile App                  |           |</w:t>
-            </w:r>
-          </w:p>
-          <w:p>
-            <w:r>
-              <w:rPr>
-                <w:rFonts w:ascii="Courier New" w:hAnsi="Courier New"/>
-                <w:sz w:val="16"/>
-              </w:rPr>
-              <w:t xml:space="preserve">|  |  (scripts,   |      |  (group emotion dashboard)           |           |</w:t>
-            </w:r>
-          </w:p>
-          <w:p>
-            <w:r>
-              <w:rPr>
-                <w:rFonts w:ascii="Courier New" w:hAnsi="Courier New"/>
-                <w:sz w:val="16"/>
-              </w:rPr>
-              <w:t xml:space="preserve">|  |   datasets,  |      +--------------------------------------+           |</w:t>
-            </w:r>
-          </w:p>
-          <w:p>
-            <w:r>
-              <w:rPr>
-                <w:rFonts w:ascii="Courier New" w:hAnsi="Courier New"/>
-                <w:sz w:val="16"/>
-              </w:rPr>
-              <w:t xml:space="preserve">|  |   model      |                                                         |</w:t>
-            </w:r>
-          </w:p>
-          <w:p>
-            <w:r>
-              <w:rPr>
-                <w:rFonts w:ascii="Courier New" w:hAnsi="Courier New"/>
-                <w:sz w:val="16"/>
-              </w:rPr>
-              <w:t xml:space="preserve">|  |   artefacts  |                                                         |</w:t>
-            </w:r>
-          </w:p>
-          <w:p>
-            <w:r>
-              <w:rPr>
-                <w:rFonts w:ascii="Courier New" w:hAnsi="Courier New"/>
-                <w:sz w:val="16"/>
-              </w:rPr>
-              <w:t xml:space="preserve">|  |   for EC2)   |                                                         |</w:t>
-            </w:r>
-          </w:p>
-          <w:p>
-            <w:r>
-              <w:rPr>
-                <w:rFonts w:ascii="Courier New" w:hAnsi="Courier New"/>
-                <w:sz w:val="16"/>
-              </w:rPr>
-              <w:t xml:space="preserve">|  +--------------+                                                         |</w:t>
-            </w:r>
-          </w:p>
-          <w:p>
-            <w:r>
-              <w:rPr>
-                <w:rFonts w:ascii="Courier New" w:hAnsi="Courier New"/>
-                <w:sz w:val="16"/>
-              </w:rPr>
-              <w:t xml:space="preserve">+---------------------------------------------------------------------------+</w:t>
+              <w:t>+---------------------------------------------------------------------------+</w:t>
+            </w:r>
+          </w:p>
+          <w:p>
+            <w:proofErr w:type="gramStart"/>
+            <w:r>
+              <w:rPr>
+                <w:rFonts w:ascii="Courier New" w:hAnsi="Courier New"/>
+                <w:sz w:val="16"/>
+              </w:rPr>
+              <w:t>|  CLOUD</w:t>
+            </w:r>
+            <w:proofErr w:type="gramEnd"/>
+            <w:r>
+              <w:rPr>
+                <w:rFonts w:ascii="Courier New" w:hAnsi="Courier New"/>
+                <w:sz w:val="16"/>
+              </w:rPr>
+              <w:t xml:space="preserve"> (AWS eu-west-1)                                                    |</w:t>
+            </w:r>
+          </w:p>
+          <w:p>
+            <w:r>
+              <w:rPr>
+                <w:rFonts w:ascii="Courier New" w:hAnsi="Courier New"/>
+                <w:sz w:val="16"/>
+              </w:rPr>
+              <w:t>|                                                                           |</w:t>
+            </w:r>
+          </w:p>
+          <w:p>
+            <w:r>
+              <w:rPr>
+                <w:rFonts w:ascii="Courier New" w:hAnsi="Courier New"/>
+                <w:sz w:val="16"/>
+              </w:rPr>
+              <w:t>|  +----------------+                                                       |</w:t>
+            </w:r>
+          </w:p>
+          <w:p>
+            <w:proofErr w:type="gramStart"/>
+            <w:r>
+              <w:rPr>
+                <w:rFonts w:ascii="Courier New" w:hAnsi="Courier New"/>
+                <w:sz w:val="16"/>
+              </w:rPr>
+              <w:t>|  |</w:t>
+            </w:r>
+            <w:proofErr w:type="gramEnd"/>
+            <w:r>
+              <w:rPr>
+                <w:rFonts w:ascii="Courier New" w:hAnsi="Courier New"/>
+                <w:sz w:val="16"/>
+              </w:rPr>
+              <w:t xml:space="preserve">  API Gateway   |                                                       |</w:t>
+            </w:r>
+          </w:p>
+          <w:p>
+            <w:proofErr w:type="gramStart"/>
+            <w:r>
+              <w:rPr>
+                <w:rFonts w:ascii="Courier New" w:hAnsi="Courier New"/>
+                <w:sz w:val="16"/>
+              </w:rPr>
+              <w:t>|  |</w:t>
+            </w:r>
+            <w:proofErr w:type="gramEnd"/>
+            <w:r>
+              <w:rPr>
+                <w:rFonts w:ascii="Courier New" w:hAnsi="Courier New"/>
+                <w:sz w:val="16"/>
+              </w:rPr>
+              <w:t xml:space="preserve">  + Cognito auth|                                                       |</w:t>
+            </w:r>
+          </w:p>
+          <w:p>
+            <w:r>
+              <w:rPr>
+                <w:rFonts w:ascii="Courier New" w:hAnsi="Courier New"/>
+                <w:sz w:val="16"/>
+              </w:rPr>
+              <w:t>|  +-------+--------+                                                       |</w:t>
+            </w:r>
+          </w:p>
+          <w:p>
+            <w:r>
+              <w:rPr>
+                <w:rFonts w:ascii="Courier New" w:hAnsi="Courier New"/>
+                <w:sz w:val="16"/>
+              </w:rPr>
+              <w:t>|          |                                                                 |</w:t>
+            </w:r>
+          </w:p>
+          <w:p>
+            <w:r>
+              <w:rPr>
+                <w:rFonts w:ascii="Courier New" w:hAnsi="Courier New"/>
+                <w:sz w:val="16"/>
+              </w:rPr>
+              <w:t>|          v                                                                 |</w:t>
+            </w:r>
+          </w:p>
+          <w:p>
+            <w:r>
+              <w:rPr>
+                <w:rFonts w:ascii="Courier New" w:hAnsi="Courier New"/>
+                <w:sz w:val="16"/>
+              </w:rPr>
+              <w:t>|  +--------------------------------------------------------------------+   |</w:t>
+            </w:r>
+          </w:p>
+          <w:p>
+            <w:proofErr w:type="gramStart"/>
+            <w:r>
+              <w:rPr>
+                <w:rFonts w:ascii="Courier New" w:hAnsi="Courier New"/>
+                <w:sz w:val="16"/>
+              </w:rPr>
+              <w:t>|  |</w:t>
+            </w:r>
+            <w:proofErr w:type="gramEnd"/>
+            <w:r>
+              <w:rPr>
+                <w:rFonts w:ascii="Courier New" w:hAnsi="Courier New"/>
+                <w:sz w:val="16"/>
+              </w:rPr>
+              <w:t xml:space="preserve">  EC2 g4dn.xlarge (same </w:t>
+            </w:r>
+            <w:proofErr w:type="gramStart"/>
+            <w:r>
+              <w:rPr>
+                <w:rFonts w:ascii="Courier New" w:hAnsi="Courier New"/>
+                <w:sz w:val="16"/>
+              </w:rPr>
+              <w:t xml:space="preserve">instance)   </w:t>
+            </w:r>
+            <w:proofErr w:type="gramEnd"/>
+            <w:r>
+              <w:rPr>
+                <w:rFonts w:ascii="Courier New" w:hAnsi="Courier New"/>
+                <w:sz w:val="16"/>
+              </w:rPr>
+              <w:t xml:space="preserve">                                |   |</w:t>
+            </w:r>
+          </w:p>
+          <w:p>
+            <w:r>
+              <w:rPr>
+                <w:rFonts w:ascii="Courier New" w:hAnsi="Courier New"/>
+                <w:sz w:val="16"/>
+              </w:rPr>
+              <w:t>|  |                                                                    |   |</w:t>
+            </w:r>
+          </w:p>
+          <w:p>
+            <w:r>
+              <w:rPr>
+                <w:rFonts w:ascii="Courier New" w:hAnsi="Courier New"/>
+                <w:sz w:val="16"/>
+              </w:rPr>
+              <w:t>|  |  +-------------------+     +------------------------------+        |   |</w:t>
+            </w:r>
+          </w:p>
+          <w:p>
+            <w:proofErr w:type="gramStart"/>
+            <w:r>
+              <w:rPr>
+                <w:rFonts w:ascii="Courier New" w:hAnsi="Courier New"/>
+                <w:sz w:val="16"/>
+              </w:rPr>
+              <w:t>|  |</w:t>
+            </w:r>
+            <w:proofErr w:type="gramEnd"/>
+            <w:r>
+              <w:rPr>
+                <w:rFonts w:ascii="Courier New" w:hAnsi="Courier New"/>
+                <w:sz w:val="16"/>
+              </w:rPr>
+              <w:t xml:space="preserve">  </w:t>
+            </w:r>
+            <w:proofErr w:type="gramStart"/>
+            <w:r>
+              <w:rPr>
+                <w:rFonts w:ascii="Courier New" w:hAnsi="Courier New"/>
+                <w:sz w:val="16"/>
+              </w:rPr>
+              <w:t>|  FastAPI</w:t>
+            </w:r>
+            <w:proofErr w:type="gramEnd"/>
+            <w:r>
+              <w:rPr>
+                <w:rFonts w:ascii="Courier New" w:hAnsi="Courier New"/>
+                <w:sz w:val="16"/>
+              </w:rPr>
+              <w:t xml:space="preserve"> </w:t>
+            </w:r>
+            <w:proofErr w:type="gramStart"/>
+            <w:r>
+              <w:rPr>
+                <w:rFonts w:ascii="Courier New" w:hAnsi="Courier New"/>
+                <w:sz w:val="16"/>
+              </w:rPr>
+              <w:t>backend  |</w:t>
+            </w:r>
+            <w:proofErr w:type="gramEnd"/>
+            <w:r>
+              <w:rPr>
+                <w:rFonts w:ascii="Courier New" w:hAnsi="Courier New"/>
+                <w:sz w:val="16"/>
+              </w:rPr>
+              <w:t>----&gt;</w:t>
+            </w:r>
+            <w:proofErr w:type="gramStart"/>
+            <w:r>
+              <w:rPr>
+                <w:rFonts w:ascii="Courier New" w:hAnsi="Courier New"/>
+                <w:sz w:val="16"/>
+              </w:rPr>
+              <w:t>|  VLM</w:t>
+            </w:r>
+            <w:proofErr w:type="gramEnd"/>
+            <w:r>
+              <w:rPr>
+                <w:rFonts w:ascii="Courier New" w:hAnsi="Courier New"/>
+                <w:sz w:val="16"/>
+              </w:rPr>
+              <w:t xml:space="preserve"> inference server        |        |   |</w:t>
+            </w:r>
+          </w:p>
+          <w:p>
+            <w:proofErr w:type="gramStart"/>
+            <w:r>
+              <w:rPr>
+                <w:rFonts w:ascii="Courier New" w:hAnsi="Courier New"/>
+                <w:sz w:val="16"/>
+              </w:rPr>
+              <w:t>|  |</w:t>
+            </w:r>
+            <w:proofErr w:type="gramEnd"/>
+            <w:r>
+              <w:rPr>
+                <w:rFonts w:ascii="Courier New" w:hAnsi="Courier New"/>
+                <w:sz w:val="16"/>
+              </w:rPr>
+              <w:t xml:space="preserve">  </w:t>
+            </w:r>
+            <w:proofErr w:type="gramStart"/>
+            <w:r>
+              <w:rPr>
+                <w:rFonts w:ascii="Courier New" w:hAnsi="Courier New"/>
+                <w:sz w:val="16"/>
+              </w:rPr>
+              <w:t>|  (</w:t>
+            </w:r>
+            <w:proofErr w:type="gramEnd"/>
+            <w:r>
+              <w:rPr>
+                <w:rFonts w:ascii="Courier New" w:hAnsi="Courier New"/>
+                <w:sz w:val="16"/>
+              </w:rPr>
+              <w:t xml:space="preserve">port 8000)      |     </w:t>
+            </w:r>
+            <w:proofErr w:type="gramStart"/>
+            <w:r>
+              <w:rPr>
+                <w:rFonts w:ascii="Courier New" w:hAnsi="Courier New"/>
+                <w:sz w:val="16"/>
+              </w:rPr>
+              <w:t>|  (</w:t>
+            </w:r>
+            <w:proofErr w:type="gramEnd"/>
+            <w:r>
+              <w:rPr>
+                <w:rFonts w:ascii="Courier New" w:hAnsi="Courier New"/>
+                <w:sz w:val="16"/>
+              </w:rPr>
+              <w:t>separate process, port     |        |   |</w:t>
+            </w:r>
+          </w:p>
+          <w:p>
+            <w:proofErr w:type="gramStart"/>
+            <w:r>
+              <w:rPr>
+                <w:rFonts w:ascii="Courier New" w:hAnsi="Courier New"/>
+                <w:sz w:val="16"/>
+              </w:rPr>
+              <w:t>|  |</w:t>
+            </w:r>
+            <w:proofErr w:type="gramEnd"/>
+            <w:r>
+              <w:rPr>
+                <w:rFonts w:ascii="Courier New" w:hAnsi="Courier New"/>
+                <w:sz w:val="16"/>
+              </w:rPr>
+              <w:t xml:space="preserve">  +--------+----------+     |   8001)                      |        |   |</w:t>
+            </w:r>
+          </w:p>
+          <w:p>
+            <w:r>
+              <w:rPr>
+                <w:rFonts w:ascii="Courier New" w:hAnsi="Courier New"/>
+                <w:sz w:val="16"/>
+              </w:rPr>
+              <w:t>|  |           |                +------------------------------+        |   |</w:t>
+            </w:r>
+          </w:p>
+          <w:p>
+            <w:proofErr w:type="gramStart"/>
+            <w:r>
+              <w:rPr>
+                <w:rFonts w:ascii="Courier New" w:hAnsi="Courier New"/>
+                <w:sz w:val="16"/>
+              </w:rPr>
+              <w:t>|  |</w:t>
+            </w:r>
+            <w:proofErr w:type="gramEnd"/>
+            <w:r>
+              <w:rPr>
+                <w:rFonts w:ascii="Courier New" w:hAnsi="Courier New"/>
+                <w:sz w:val="16"/>
+              </w:rPr>
+              <w:t xml:space="preserve">           v                                                        |   |</w:t>
+            </w:r>
+          </w:p>
+          <w:p>
+            <w:r>
+              <w:rPr>
+                <w:rFonts w:ascii="Courier New" w:hAnsi="Courier New"/>
+                <w:sz w:val="16"/>
+              </w:rPr>
+              <w:t>|  |  +-------------------+                                             |   |</w:t>
+            </w:r>
+          </w:p>
+          <w:p>
+            <w:proofErr w:type="gramStart"/>
+            <w:r>
+              <w:rPr>
+                <w:rFonts w:ascii="Courier New" w:hAnsi="Courier New"/>
+                <w:sz w:val="16"/>
+              </w:rPr>
+              <w:t>|  |</w:t>
+            </w:r>
+            <w:proofErr w:type="gramEnd"/>
+            <w:r>
+              <w:rPr>
+                <w:rFonts w:ascii="Courier New" w:hAnsi="Courier New"/>
+                <w:sz w:val="16"/>
+              </w:rPr>
+              <w:t xml:space="preserve">  </w:t>
+            </w:r>
+            <w:proofErr w:type="gramStart"/>
+            <w:r>
+              <w:rPr>
+                <w:rFonts w:ascii="Courier New" w:hAnsi="Courier New"/>
+                <w:sz w:val="16"/>
+              </w:rPr>
+              <w:t>|  MySQL</w:t>
+            </w:r>
+            <w:proofErr w:type="gramEnd"/>
+            <w:r>
+              <w:rPr>
+                <w:rFonts w:ascii="Courier New" w:hAnsi="Courier New"/>
+                <w:sz w:val="16"/>
+              </w:rPr>
+              <w:t xml:space="preserve">            |                                             |   |</w:t>
+            </w:r>
+          </w:p>
+          <w:p>
+            <w:proofErr w:type="gramStart"/>
+            <w:r>
+              <w:rPr>
+                <w:rFonts w:ascii="Courier New" w:hAnsi="Courier New"/>
+                <w:sz w:val="16"/>
+              </w:rPr>
+              <w:t>|  |</w:t>
+            </w:r>
+            <w:proofErr w:type="gramEnd"/>
+            <w:r>
+              <w:rPr>
+                <w:rFonts w:ascii="Courier New" w:hAnsi="Courier New"/>
+                <w:sz w:val="16"/>
+              </w:rPr>
+              <w:t xml:space="preserve">  </w:t>
+            </w:r>
+            <w:proofErr w:type="gramStart"/>
+            <w:r>
+              <w:rPr>
+                <w:rFonts w:ascii="Courier New" w:hAnsi="Courier New"/>
+                <w:sz w:val="16"/>
+              </w:rPr>
+              <w:t>|  (</w:t>
+            </w:r>
+            <w:proofErr w:type="gramEnd"/>
+            <w:r>
+              <w:rPr>
+                <w:rFonts w:ascii="Courier New" w:hAnsi="Courier New"/>
+                <w:sz w:val="16"/>
+              </w:rPr>
+              <w:t>localhost:3306) |                                             |   |</w:t>
+            </w:r>
+          </w:p>
+          <w:p>
+            <w:r>
+              <w:rPr>
+                <w:rFonts w:ascii="Courier New" w:hAnsi="Courier New"/>
+                <w:sz w:val="16"/>
+              </w:rPr>
+              <w:t>|  |  +-------------------+                                             |   |</w:t>
+            </w:r>
+          </w:p>
+          <w:p>
+            <w:r>
+              <w:rPr>
+                <w:rFonts w:ascii="Courier New" w:hAnsi="Courier New"/>
+                <w:sz w:val="16"/>
+              </w:rPr>
+              <w:t>|  +--------------------------------------------------------------------+   |</w:t>
+            </w:r>
+          </w:p>
+          <w:p>
+            <w:r>
+              <w:rPr>
+                <w:rFonts w:ascii="Courier New" w:hAnsi="Courier New"/>
+                <w:sz w:val="16"/>
+              </w:rPr>
+              <w:t>|                                                                           |</w:t>
+            </w:r>
+          </w:p>
+          <w:p>
+            <w:r>
+              <w:rPr>
+                <w:rFonts w:ascii="Courier New" w:hAnsi="Courier New"/>
+                <w:sz w:val="16"/>
+              </w:rPr>
+              <w:t>|  +--------------+      +--------------------------------------+           |</w:t>
+            </w:r>
+          </w:p>
+          <w:p>
+            <w:proofErr w:type="gramStart"/>
+            <w:r>
+              <w:rPr>
+                <w:rFonts w:ascii="Courier New" w:hAnsi="Courier New"/>
+                <w:sz w:val="16"/>
+              </w:rPr>
+              <w:t>|  |</w:t>
+            </w:r>
+            <w:proofErr w:type="gramEnd"/>
+            <w:r>
+              <w:rPr>
+                <w:rFonts w:ascii="Courier New" w:hAnsi="Courier New"/>
+                <w:sz w:val="16"/>
+              </w:rPr>
+              <w:t xml:space="preserve">  S3          |      </w:t>
+            </w:r>
+            <w:proofErr w:type="gramStart"/>
+            <w:r>
+              <w:rPr>
+                <w:rFonts w:ascii="Courier New" w:hAnsi="Courier New"/>
+                <w:sz w:val="16"/>
+              </w:rPr>
+              <w:t>|  Flutter</w:t>
+            </w:r>
+            <w:proofErr w:type="gramEnd"/>
+            <w:r>
+              <w:rPr>
+                <w:rFonts w:ascii="Courier New" w:hAnsi="Courier New"/>
+                <w:sz w:val="16"/>
+              </w:rPr>
+              <w:t xml:space="preserve"> Mobile App                  |           |</w:t>
+            </w:r>
+          </w:p>
+          <w:p>
+            <w:proofErr w:type="gramStart"/>
+            <w:r>
+              <w:rPr>
+                <w:rFonts w:ascii="Courier New" w:hAnsi="Courier New"/>
+                <w:sz w:val="16"/>
+              </w:rPr>
+              <w:t>|  |</w:t>
+            </w:r>
+            <w:proofErr w:type="gramEnd"/>
+            <w:r>
+              <w:rPr>
+                <w:rFonts w:ascii="Courier New" w:hAnsi="Courier New"/>
+                <w:sz w:val="16"/>
+              </w:rPr>
+              <w:t xml:space="preserve">  (</w:t>
+            </w:r>
+            <w:proofErr w:type="gramStart"/>
+            <w:r>
+              <w:rPr>
+                <w:rFonts w:ascii="Courier New" w:hAnsi="Courier New"/>
+                <w:sz w:val="16"/>
+              </w:rPr>
+              <w:t xml:space="preserve">scripts,   </w:t>
+            </w:r>
+            <w:proofErr w:type="gramEnd"/>
+            <w:r>
+              <w:rPr>
+                <w:rFonts w:ascii="Courier New" w:hAnsi="Courier New"/>
+                <w:sz w:val="16"/>
+              </w:rPr>
+              <w:t xml:space="preserve">|      </w:t>
+            </w:r>
+            <w:proofErr w:type="gramStart"/>
+            <w:r>
+              <w:rPr>
+                <w:rFonts w:ascii="Courier New" w:hAnsi="Courier New"/>
+                <w:sz w:val="16"/>
+              </w:rPr>
+              <w:t>|  (</w:t>
+            </w:r>
+            <w:proofErr w:type="gramEnd"/>
+            <w:r>
+              <w:rPr>
+                <w:rFonts w:ascii="Courier New" w:hAnsi="Courier New"/>
+                <w:sz w:val="16"/>
+              </w:rPr>
+              <w:t xml:space="preserve">group emotion </w:t>
+            </w:r>
+            <w:proofErr w:type="gramStart"/>
+            <w:r>
+              <w:rPr>
+                <w:rFonts w:ascii="Courier New" w:hAnsi="Courier New"/>
+                <w:sz w:val="16"/>
+              </w:rPr>
+              <w:t xml:space="preserve">dashboard)   </w:t>
+            </w:r>
+            <w:proofErr w:type="gramEnd"/>
+            <w:r>
+              <w:rPr>
+                <w:rFonts w:ascii="Courier New" w:hAnsi="Courier New"/>
+                <w:sz w:val="16"/>
+              </w:rPr>
+              <w:t xml:space="preserve">        |           |</w:t>
+            </w:r>
+          </w:p>
+          <w:p>
+            <w:proofErr w:type="gramStart"/>
+            <w:r>
+              <w:rPr>
+                <w:rFonts w:ascii="Courier New" w:hAnsi="Courier New"/>
+                <w:sz w:val="16"/>
+              </w:rPr>
+              <w:t>|  |</w:t>
+            </w:r>
+            <w:proofErr w:type="gramEnd"/>
+            <w:r>
+              <w:rPr>
+                <w:rFonts w:ascii="Courier New" w:hAnsi="Courier New"/>
+                <w:sz w:val="16"/>
+              </w:rPr>
+              <w:t xml:space="preserve">   </w:t>
+            </w:r>
+            <w:proofErr w:type="gramStart"/>
+            <w:r>
+              <w:rPr>
+                <w:rFonts w:ascii="Courier New" w:hAnsi="Courier New"/>
+                <w:sz w:val="16"/>
+              </w:rPr>
+              <w:t>datasets,  |</w:t>
+            </w:r>
+            <w:proofErr w:type="gramEnd"/>
+            <w:r>
+              <w:rPr>
+                <w:rFonts w:ascii="Courier New" w:hAnsi="Courier New"/>
+                <w:sz w:val="16"/>
+              </w:rPr>
+              <w:t xml:space="preserve">      +--------------------------------------+           |</w:t>
+            </w:r>
+          </w:p>
+          <w:p>
+            <w:proofErr w:type="gramStart"/>
+            <w:r>
+              <w:rPr>
+                <w:rFonts w:ascii="Courier New" w:hAnsi="Courier New"/>
+                <w:sz w:val="16"/>
+              </w:rPr>
+              <w:t>|  |</w:t>
+            </w:r>
+            <w:proofErr w:type="gramEnd"/>
+            <w:r>
+              <w:rPr>
+                <w:rFonts w:ascii="Courier New" w:hAnsi="Courier New"/>
+                <w:sz w:val="16"/>
+              </w:rPr>
+              <w:t xml:space="preserve">   model      |                                                         |</w:t>
+            </w:r>
+          </w:p>
+          <w:p>
+            <w:proofErr w:type="gramStart"/>
+            <w:r>
+              <w:rPr>
+                <w:rFonts w:ascii="Courier New" w:hAnsi="Courier New"/>
+                <w:sz w:val="16"/>
+              </w:rPr>
+              <w:t>|  |</w:t>
+            </w:r>
+            <w:proofErr w:type="gramEnd"/>
+            <w:r>
+              <w:rPr>
+                <w:rFonts w:ascii="Courier New" w:hAnsi="Courier New"/>
+                <w:sz w:val="16"/>
+              </w:rPr>
+              <w:t xml:space="preserve">   </w:t>
+            </w:r>
+            <w:proofErr w:type="gramStart"/>
+            <w:r>
+              <w:rPr>
+                <w:rFonts w:ascii="Courier New" w:hAnsi="Courier New"/>
+                <w:sz w:val="16"/>
+              </w:rPr>
+              <w:t>artefacts  |</w:t>
+            </w:r>
+            <w:proofErr w:type="gramEnd"/>
+            <w:r>
+              <w:rPr>
+                <w:rFonts w:ascii="Courier New" w:hAnsi="Courier New"/>
+                <w:sz w:val="16"/>
+              </w:rPr>
+              <w:t xml:space="preserve">                                                         |</w:t>
+            </w:r>
+          </w:p>
+          <w:p>
+            <w:proofErr w:type="gramStart"/>
+            <w:r>
+              <w:rPr>
+                <w:rFonts w:ascii="Courier New" w:hAnsi="Courier New"/>
+                <w:sz w:val="16"/>
+              </w:rPr>
+              <w:t>|  |</w:t>
+            </w:r>
+            <w:proofErr w:type="gramEnd"/>
+            <w:r>
+              <w:rPr>
+                <w:rFonts w:ascii="Courier New" w:hAnsi="Courier New"/>
+                <w:sz w:val="16"/>
+              </w:rPr>
+              <w:t xml:space="preserve">   for EC2)   |                                                         |</w:t>
+            </w:r>
+          </w:p>
+          <w:p>
+            <w:r>
+              <w:rPr>
+                <w:rFonts w:ascii="Courier New" w:hAnsi="Courier New"/>
+                <w:sz w:val="16"/>
+              </w:rPr>
+              <w:t>|  +--------------+                                                         |</w:t>
+            </w:r>
+          </w:p>
+          <w:p>
+            <w:r>
+              <w:rPr>
+                <w:rFonts w:ascii="Courier New" w:hAnsi="Courier New"/>
+                <w:sz w:val="16"/>
+              </w:rPr>
+              <w:t>+---------------------------------------------------------------------------+</w:t>
             </w:r>
           </w:p>
         </w:tc>
@@ -3009,12 +3374,6 @@
         <w:gridCol w:w="9072"/>
       </w:tblGrid>
       <w:tr>
-        <w:tblPrEx>
-          <w:tblCellMar>
-            <w:top w:w="0" w:type="dxa"/>
-            <w:bottom w:w="0" w:type="dxa"/>
-          </w:tblCellMar>
-        </w:tblPrEx>
         <w:tc>
           <w:tcPr>
             <w:tcW w:w="9072" w:type="dxa"/>
@@ -3086,12 +3445,6 @@
         <w:gridCol w:w="9072"/>
       </w:tblGrid>
       <w:tr>
-        <w:tblPrEx>
-          <w:tblCellMar>
-            <w:top w:w="0" w:type="dxa"/>
-            <w:bottom w:w="0" w:type="dxa"/>
-          </w:tblCellMar>
-        </w:tblPrEx>
         <w:tc>
           <w:tcPr>
             <w:tcW w:w="9072" w:type="dxa"/>
@@ -3147,6 +3500,7 @@
         <w:pStyle w:val="Heading2"/>
         <w:spacing w:before="160"/>
       </w:pPr>
+      <w:proofErr w:type="gramStart"/>
       <w:r>
         <w:rPr>
           <w:sz w:val="22"/>
@@ -3154,6 +3508,7 @@
         </w:rPr>
         <w:t>4.1  Results</w:t>
       </w:r>
+      <w:proofErr w:type="gramEnd"/>
     </w:p>
     <w:p>
       <w:pPr>
@@ -3174,7 +3529,11 @@
       </w:r>
       <w:proofErr w:type="spellEnd"/>
       <w:r>
-        <w:t xml:space="preserve"> as vision encoder, pre-trained on billions of images including faces and facial expressions. This prior knowledge places the model already close to the optimal solution on FER+, making any </w:t>
+        <w:t xml:space="preserve"> as vision encoder, pre-trained on billions of images including faces and facial expressions. This prior knowledge places the model already close to the optimal solution on FER+, </w:t>
+      </w:r>
+      <w:r>
+        <w:lastRenderedPageBreak/>
+        <w:t xml:space="preserve">making any </w:t>
       </w:r>
       <w:proofErr w:type="spellStart"/>
       <w:r>
@@ -3191,7 +3550,15 @@
         <w:jc w:val="both"/>
       </w:pPr>
       <w:r>
-        <w:t>{"subjects":[{"id":1,"emotion":"&lt;emotion&gt;"}],"group_emotion":"&lt;emotion&gt;"}</w:t>
+        <w:t>{"subjects</w:t>
+      </w:r>
+      <w:proofErr w:type="gramStart"/>
+      <w:r>
+        <w:t>":[</w:t>
+      </w:r>
+      <w:proofErr w:type="gramEnd"/>
+      <w:r>
+        <w:t>{"id":1,"emotion":"&lt;emotion&gt;"}],"group_emotion":"&lt;emotion&gt;"}</w:t>
       </w:r>
     </w:p>
     <w:p>
@@ -3270,12 +3637,6 @@
         <w:gridCol w:w="1633"/>
       </w:tblGrid>
       <w:tr>
-        <w:tblPrEx>
-          <w:tblCellMar>
-            <w:top w:w="0" w:type="dxa"/>
-            <w:bottom w:w="0" w:type="dxa"/>
-          </w:tblCellMar>
-        </w:tblPrEx>
         <w:tc>
           <w:tcPr>
             <w:tcW w:w="2540" w:type="dxa"/>
@@ -3423,12 +3784,6 @@
         </w:tc>
       </w:tr>
       <w:tr>
-        <w:tblPrEx>
-          <w:tblCellMar>
-            <w:top w:w="0" w:type="dxa"/>
-            <w:bottom w:w="0" w:type="dxa"/>
-          </w:tblCellMar>
-        </w:tblPrEx>
         <w:tc>
           <w:tcPr>
             <w:tcW w:w="2540" w:type="dxa"/>
@@ -3561,12 +3916,6 @@
         </w:tc>
       </w:tr>
       <w:tr>
-        <w:tblPrEx>
-          <w:tblCellMar>
-            <w:top w:w="0" w:type="dxa"/>
-            <w:bottom w:w="0" w:type="dxa"/>
-          </w:tblCellMar>
-        </w:tblPrEx>
         <w:tc>
           <w:tcPr>
             <w:tcW w:w="2540" w:type="dxa"/>
@@ -3699,12 +4048,6 @@
         </w:tc>
       </w:tr>
       <w:tr>
-        <w:tblPrEx>
-          <w:tblCellMar>
-            <w:top w:w="0" w:type="dxa"/>
-            <w:bottom w:w="0" w:type="dxa"/>
-          </w:tblCellMar>
-        </w:tblPrEx>
         <w:tc>
           <w:tcPr>
             <w:tcW w:w="2540" w:type="dxa"/>
@@ -3926,12 +4269,6 @@
         <w:gridCol w:w="1906"/>
       </w:tblGrid>
       <w:tr>
-        <w:tblPrEx>
-          <w:tblCellMar>
-            <w:top w:w="0" w:type="dxa"/>
-            <w:bottom w:w="0" w:type="dxa"/>
-          </w:tblCellMar>
-        </w:tblPrEx>
         <w:tc>
           <w:tcPr>
             <w:tcW w:w="2268" w:type="dxa"/>
@@ -4079,12 +4416,6 @@
         </w:tc>
       </w:tr>
       <w:tr>
-        <w:tblPrEx>
-          <w:tblCellMar>
-            <w:top w:w="0" w:type="dxa"/>
-            <w:bottom w:w="0" w:type="dxa"/>
-          </w:tblCellMar>
-        </w:tblPrEx>
         <w:tc>
           <w:tcPr>
             <w:tcW w:w="2268" w:type="dxa"/>
@@ -4217,12 +4548,6 @@
         </w:tc>
       </w:tr>
       <w:tr>
-        <w:tblPrEx>
-          <w:tblCellMar>
-            <w:top w:w="0" w:type="dxa"/>
-            <w:bottom w:w="0" w:type="dxa"/>
-          </w:tblCellMar>
-        </w:tblPrEx>
         <w:tc>
           <w:tcPr>
             <w:tcW w:w="2268" w:type="dxa"/>
@@ -4355,12 +4680,6 @@
         </w:tc>
       </w:tr>
       <w:tr>
-        <w:tblPrEx>
-          <w:tblCellMar>
-            <w:top w:w="0" w:type="dxa"/>
-            <w:bottom w:w="0" w:type="dxa"/>
-          </w:tblCellMar>
-        </w:tblPrEx>
         <w:tc>
           <w:tcPr>
             <w:tcW w:w="2268" w:type="dxa"/>
@@ -4493,12 +4812,6 @@
         </w:tc>
       </w:tr>
       <w:tr>
-        <w:tblPrEx>
-          <w:tblCellMar>
-            <w:top w:w="0" w:type="dxa"/>
-            <w:bottom w:w="0" w:type="dxa"/>
-          </w:tblCellMar>
-        </w:tblPrEx>
         <w:tc>
           <w:tcPr>
             <w:tcW w:w="2268" w:type="dxa"/>
@@ -4680,7 +4993,6 @@
           <w:sz w:val="20"/>
           <w:szCs w:val="20"/>
         </w:rPr>
-        <w:lastRenderedPageBreak/>
         <w:t>Table 5 — VLM benchmark comparison on FER+ test set</w:t>
       </w:r>
     </w:p>
@@ -4709,12 +5021,6 @@
         <w:gridCol w:w="1633"/>
       </w:tblGrid>
       <w:tr>
-        <w:tblPrEx>
-          <w:tblCellMar>
-            <w:top w:w="0" w:type="dxa"/>
-            <w:bottom w:w="0" w:type="dxa"/>
-          </w:tblCellMar>
-        </w:tblPrEx>
         <w:tc>
           <w:tcPr>
             <w:tcW w:w="2721" w:type="dxa"/>
@@ -4862,12 +5168,6 @@
         </w:tc>
       </w:tr>
       <w:tr>
-        <w:tblPrEx>
-          <w:tblCellMar>
-            <w:top w:w="0" w:type="dxa"/>
-            <w:bottom w:w="0" w:type="dxa"/>
-          </w:tblCellMar>
-        </w:tblPrEx>
         <w:tc>
           <w:tcPr>
             <w:tcW w:w="2721" w:type="dxa"/>
@@ -5009,12 +5309,6 @@
         </w:tc>
       </w:tr>
       <w:tr>
-        <w:tblPrEx>
-          <w:tblCellMar>
-            <w:top w:w="0" w:type="dxa"/>
-            <w:bottom w:w="0" w:type="dxa"/>
-          </w:tblCellMar>
-        </w:tblPrEx>
         <w:tc>
           <w:tcPr>
             <w:tcW w:w="2721" w:type="dxa"/>
@@ -5156,12 +5450,6 @@
         </w:tc>
       </w:tr>
       <w:tr>
-        <w:tblPrEx>
-          <w:tblCellMar>
-            <w:top w:w="0" w:type="dxa"/>
-            <w:bottom w:w="0" w:type="dxa"/>
-          </w:tblCellMar>
-        </w:tblPrEx>
         <w:tc>
           <w:tcPr>
             <w:tcW w:w="2721" w:type="dxa"/>
@@ -5316,12 +5604,6 @@
         <w:gridCol w:w="9072"/>
       </w:tblGrid>
       <w:tr>
-        <w:tblPrEx>
-          <w:tblCellMar>
-            <w:top w:w="0" w:type="dxa"/>
-            <w:bottom w:w="0" w:type="dxa"/>
-          </w:tblCellMar>
-        </w:tblPrEx>
         <w:tc>
           <w:tcPr>
             <w:tcW w:w="9072" w:type="dxa"/>
@@ -5422,6 +5704,7 @@
         <w:jc w:val="both"/>
       </w:pPr>
       <w:r>
+        <w:lastRenderedPageBreak/>
         <w:t>The end-to-end latency — frame capture to MySQL write — is estimated at 1.5–3.2s under normal conditions (frame encoding: ∼0.1s; transmission: ∼0.3–0.8s; VLM inference: ∼1.0–2.2s; DB write: ∼0.05s), satisfying NFR1. The use of a direct single-word prompt eliminated all invalid predictions and substantially improved performance compared to complex JSON prompts. Grouping negative emotions into a distress class raised the Macro F1 from 0.436 to 0.691, reflecting a more operationally meaningful classification for park management.</w:t>
       </w:r>
     </w:p>
@@ -5430,6 +5713,7 @@
         <w:pStyle w:val="Heading2"/>
         <w:spacing w:before="160"/>
       </w:pPr>
+      <w:proofErr w:type="gramStart"/>
       <w:r>
         <w:rPr>
           <w:sz w:val="22"/>
@@ -5446,6 +5730,7 @@
         <w:t>EdgeCloudSim</w:t>
       </w:r>
       <w:proofErr w:type="spellEnd"/>
+      <w:proofErr w:type="gramEnd"/>
       <w:r>
         <w:rPr>
           <w:sz w:val="22"/>
@@ -5490,12 +5775,6 @@
         <w:gridCol w:w="9072"/>
       </w:tblGrid>
       <w:tr>
-        <w:tblPrEx>
-          <w:tblCellMar>
-            <w:top w:w="0" w:type="dxa"/>
-            <w:bottom w:w="0" w:type="dxa"/>
-          </w:tblCellMar>
-        </w:tblPrEx>
         <w:tc>
           <w:tcPr>
             <w:tcW w:w="9072" w:type="dxa"/>
@@ -5580,6 +5859,7 @@
         <w:pStyle w:val="Heading1"/>
         <w:spacing w:before="200" w:after="100"/>
       </w:pPr>
+      <w:proofErr w:type="gramStart"/>
       <w:r>
         <w:rPr>
           <w:sz w:val="24"/>
@@ -5587,6 +5867,7 @@
         </w:rPr>
         <w:t>5  Conclusion</w:t>
       </w:r>
+      <w:proofErr w:type="gramEnd"/>
     </w:p>
     <w:p>
       <w:pPr>
@@ -5652,11 +5933,7 @@
       </w:r>
       <w:proofErr w:type="spellEnd"/>
       <w:r>
-        <w:t xml:space="preserve">-V and Moondream2 benchmarks for full model comparison, short video clip analysis for improved temporal emotion consistency, motion-triggered capture to reduce unnecessary transmissions, anomaly alert notifications for sustained distress signals </w:t>
-      </w:r>
-      <w:r>
-        <w:lastRenderedPageBreak/>
-        <w:t>in the Flutter app, and domain-specific evaluation on images collected directly within the park environment.</w:t>
+        <w:t>-V and Moondream2 benchmarks for full model comparison, short video clip analysis for improved temporal emotion consistency, motion-triggered capture to reduce unnecessary transmissions, anomaly alert notifications for sustained distress signals in the Flutter app, and domain-specific evaluation on images collected directly within the park environment.</w:t>
       </w:r>
     </w:p>
     <w:sectPr>

</xml_diff>